<commit_message>
docs: parecer critico, diretriz 01 de referencias historicas e relatorio preliminar versao 2
Reconcilia votos apos 17h por faixa (TSE 32.399/1.981/13; extraidos 32.337/1.982/11),
explica a diferenca de 798 votos (70 secoes do exterior ausentes), corrige o zero
falso de 2024, publica o inventario das 1.443 secoes incoerentes, valida o fuso contra
regra externa por UF, restringe a conclusao de materialidade e acrescenta abstencao e
votos invalidos entre os turnos.

Co-Authored-By: Claude Opus 5.5 <noreply@anthropic.com>
Claude-Session: https://claude.ai/code/session_01UACjdrybsMbcWcgpC7rucs
</commit_message>
<xml_diff>
--- a/estudos/05_simulacao_temporal/RELATORIO_PRELIMINAR_2T2026.docx
+++ b/estudos/05_simulacao_temporal/RELATORIO_PRELIMINAR_2T2026.docx
@@ -41,7 +41,7 @@
           <w:b/>
           <w:sz w:val="24"/>
         </w:rPr>
-        <w:t>RELATÓRIO PRELIMINAR</w:t>
+        <w:t>RELATÓRIO PRELIMINAR (VERSÃO 2)</w:t>
       </w:r>
     </w:p>
     <w:p>
@@ -116,7 +116,7 @@
           <w:b/>
           <w:sz w:val="24"/>
         </w:rPr>
-        <w:t>RELATÓRIO PRELIMINAR</w:t>
+        <w:t>RELATÓRIO PRELIMINAR (VERSÃO 2)</w:t>
       </w:r>
     </w:p>
     <w:p>
@@ -206,7 +206,7 @@
           <w:b w:val="0"/>
           <w:sz w:val="24"/>
         </w:rPr>
-        <w:t>Este relatório examina se as seções eleitorais que encerraram a votação mais tarde no 2º turno das Eleições Gerais de 2026, inclusive aquelas mantidas em funcionamento até 19h por decisão excepcional, apresentaram composição de votos diferente das demais seções do mesmo local de votação. A unidade de análise é a seção, e o desfecho abrange todos os votos de cada seção, e não apenas os registrados após 17h. Foram processados os arquivos públicos transmitidos para totalização de todas as unidades da Federação: 499.178 seções, com imagem do boletim de urna e log da urna eletrônica. Os horários provêm do relógio da própria urna, convertidos para o horário de Brasília. Os dados extraídos reproduzem os números oficiais: a soma dos boletins difere em 798 votos dos totais oficiais de presidente (0,0006%), e a contagem de votos após 17h (34.330) difere em 0,18% da informada pelo Tribunal Superior Eleitoral (34.393). A prorrogação teve efeito material mínimo sobre a votação: 6.336 seções fecharam após 19h, mas o último voto dessas seções ocorreu, em mediana, às 16h59, e apenas 11 votos foram registrados no país após 19h. Nos contrastes pré-registrados, realizados dentro do local de votação, não se observou diferença estatisticamente significativa: último voto após 19h, +0,81 ponto percentual (IC 95%: -1,67 a +3,29; 11 seções); após 17h10, -0,08 p.p. (IC 95%: -0,27 a +0,12). O contraste exploratório com todas as seções que fecharam após 19h resultou em -0,04 p.p. (IC 95%: -0,26 a +0,19). A diferença bruta de 3,5 p.p. a favor do candidato 13 nessas seções decorre de sua concentração geográfica e desaparece na comparação dentro do local. O placebo do 2º turno municipal de 2024, sem prorrogação, também foi nulo. Mesmo a transferência de todos os votos das seções que fecharam após 19h não alteraria o resultado. A conclusão é condicionada à exatidão do relógio da urna e não alcança hipóteses de comprometimento uniforme do software.</w:t>
+        <w:t>Este relatório examina uma pergunta delimitada: se as seções eleitorais que encerraram a votação mais tarde no 2º turno das Eleições Gerais de 2026, inclusive as mantidas em funcionamento até 19h, apresentaram composição de votos diferente das demais seções do mesmo local de votação. Não se trata de auditoria abrangente da eleição. A unidade de análise é a seção, e o desfecho abrange todos os seus votos. Foram processados os arquivos públicos transmitidos para totalização de todas as unidades da Federação (499.178 seções). Os horários provêm do relógio da própria urna, convertidos para o horário de Brasília. Os dados reproduzem os números oficiais: a diferença de 798 votos nos totais de presidente corresponde a 70 seções do exterior ausentes dos arquivos transmitidos; os votos após 17h somam 34.330, ante 34.393 informados pelo Tribunal Superior Eleitoral. A prorrogação gerou pouca votação: 11 votos após 19h, ante 13 informados oficialmente, diferença ainda não reconciliada. Os contrastes confirmatórios, feitos dentro do local de votação, não identificaram associação estatisticamente significativa: último voto após 19h, +0,81 ponto percentual (IC 95%: -1,67 a +3,29; 11 seções); após 17h10, -0,08 p.p. (IC 95%: -0,27 a +0,12). Um contraste de calibração identificou efeito muito pequeno (-0,05 p.p.; p = 0,04), de magnitude semelhante à do placebo municipal de 2024; o contraste para governador após 19h não foi estimável. A diferença bruta de 3,5 p.p. nas seções que fecharam após 19h desaparece na comparação dentro do local. Os resultados dependem da exatidão dos registros da urna, não alcançam comprometimento uniforme do software e não substituem a calibração temporal por minuto exigida pela diretriz metodológica do projeto, que permanece pendente.</w:t>
       </w:r>
     </w:p>
     <w:p>
@@ -265,6 +265,24 @@
           <w:sz w:val="24"/>
         </w:rPr>
         <w:t>1 INTRODUÇÃO</w:t>
+        <w:tab/>
+        <w:t>4</w:t>
+      </w:r>
+    </w:p>
+    <w:p>
+      <w:pPr>
+        <w:tabs>
+          <w:tab w:pos="9071" w:val="right" w:leader="dot"/>
+        </w:tabs>
+        <w:spacing w:line="360" w:lineRule="auto" w:after="0"/>
+      </w:pPr>
+      <w:r>
+        <w:rPr>
+          <w:rFonts w:ascii="Arial" w:hAnsi="Arial"/>
+          <w:b w:val="0"/>
+          <w:sz w:val="24"/>
+        </w:rPr>
+        <w:t>1.1 Escopo e limites deste relatório</w:t>
         <w:tab/>
         <w:t>4</w:t>
       </w:r>
@@ -354,9 +372,9 @@
           <w:b w:val="0"/>
           <w:sz w:val="24"/>
         </w:rPr>
-        <w:t>3.3 Horário de Brasília</w:t>
+        <w:t>3.3 Eventos temporais distintos</w:t>
         <w:tab/>
-        <w:t>5</w:t>
+        <w:t>6</w:t>
       </w:r>
     </w:p>
     <w:p>
@@ -372,9 +390,9 @@
           <w:b w:val="0"/>
           <w:sz w:val="24"/>
         </w:rPr>
-        <w:t>3.4 Verificações de coerência</w:t>
+        <w:t>3.4 Horário de Brasília</w:t>
         <w:tab/>
-        <w:t>5</w:t>
+        <w:t>6</w:t>
       </w:r>
     </w:p>
     <w:p>
@@ -390,7 +408,25 @@
           <w:b w:val="0"/>
           <w:sz w:val="24"/>
         </w:rPr>
-        <w:t>3.5 Estimador</w:t>
+        <w:t>3.5 Verificações de coerência e população de auditoria</w:t>
+        <w:tab/>
+        <w:t>6</w:t>
+      </w:r>
+    </w:p>
+    <w:p>
+      <w:pPr>
+        <w:tabs>
+          <w:tab w:pos="9071" w:val="right" w:leader="dot"/>
+        </w:tabs>
+        <w:spacing w:line="360" w:lineRule="auto" w:after="0"/>
+      </w:pPr>
+      <w:r>
+        <w:rPr>
+          <w:rFonts w:ascii="Arial" w:hAnsi="Arial"/>
+          <w:b w:val="0"/>
+          <w:sz w:val="24"/>
+        </w:rPr>
+        <w:t>3.6 Estimador</w:t>
         <w:tab/>
         <w:t>6</w:t>
       </w:r>
@@ -410,7 +446,7 @@
         </w:rPr>
         <w:t>4 RESULTADOS</w:t>
         <w:tab/>
-        <w:t>6</w:t>
+        <w:t>7</w:t>
       </w:r>
     </w:p>
     <w:p>
@@ -428,7 +464,7 @@
         </w:rPr>
         <w:t>4.1 Validação contra os números oficiais</w:t>
         <w:tab/>
-        <w:t>6</w:t>
+        <w:t>7</w:t>
       </w:r>
     </w:p>
     <w:p>
@@ -446,7 +482,7 @@
         </w:rPr>
         <w:t>4.2 O que ocorreu depois das 17h e das 19h</w:t>
         <w:tab/>
-        <w:t>6</w:t>
+        <w:t>7</w:t>
       </w:r>
     </w:p>
     <w:p>
@@ -464,7 +500,7 @@
         </w:rPr>
         <w:t>4.3 Placebo: 2º turno municipal de 2024</w:t>
         <w:tab/>
-        <w:t>7</w:t>
+        <w:t>8</w:t>
       </w:r>
     </w:p>
     <w:p>
@@ -482,7 +518,7 @@
         </w:rPr>
         <w:t>4.4 Contrastes pré-registrados no 2º turno de 2026</w:t>
         <w:tab/>
-        <w:t>7</w:t>
+        <w:t>8</w:t>
       </w:r>
     </w:p>
     <w:p>
@@ -500,7 +536,7 @@
         </w:rPr>
         <w:t>4.5 Contrastes exploratórios</w:t>
         <w:tab/>
-        <w:t>7</w:t>
+        <w:t>8</w:t>
       </w:r>
     </w:p>
     <w:p>
@@ -516,9 +552,9 @@
           <w:b w:val="0"/>
           <w:sz w:val="24"/>
         </w:rPr>
-        <w:t>4.6 Por que a comparação bruta engana</w:t>
+        <w:t>4.6 Comparação bruta e comparação dentro do local</w:t>
         <w:tab/>
-        <w:t>8</w:t>
+        <w:t>9</w:t>
       </w:r>
     </w:p>
     <w:p>
@@ -536,7 +572,7 @@
         </w:rPr>
         <w:t>4.7 Materialidade</w:t>
         <w:tab/>
-        <w:t>8</w:t>
+        <w:t>9</w:t>
       </w:r>
     </w:p>
     <w:p>
@@ -552,9 +588,27 @@
           <w:b w:val="0"/>
           <w:sz w:val="24"/>
         </w:rPr>
-        <w:t>4.8 Estudo 03: hipótese do mesário (piloto no Tocantins)</w:t>
+        <w:t>4.8 Abstenção e votos inválidos entre os turnos</w:t>
         <w:tab/>
-        <w:t>8</w:t>
+        <w:t>9</w:t>
+      </w:r>
+    </w:p>
+    <w:p>
+      <w:pPr>
+        <w:tabs>
+          <w:tab w:pos="9071" w:val="right" w:leader="dot"/>
+        </w:tabs>
+        <w:spacing w:line="360" w:lineRule="auto" w:after="0"/>
+      </w:pPr>
+      <w:r>
+        <w:rPr>
+          <w:rFonts w:ascii="Arial" w:hAnsi="Arial"/>
+          <w:b w:val="0"/>
+          <w:sz w:val="24"/>
+        </w:rPr>
+        <w:t>4.9 Estudo 03: hipótese do mesário (piloto no Tocantins)</w:t>
+        <w:tab/>
+        <w:t>10</w:t>
       </w:r>
     </w:p>
     <w:p>
@@ -572,7 +626,7 @@
         </w:rPr>
         <w:t>5 DISCUSSÃO E LIMITAÇÕES</w:t>
         <w:tab/>
-        <w:t>9</w:t>
+        <w:t>10</w:t>
       </w:r>
     </w:p>
     <w:p>
@@ -590,7 +644,7 @@
         </w:rPr>
         <w:t>6 CONCLUSÕES PRELIMINARES</w:t>
         <w:tab/>
-        <w:t>9</w:t>
+        <w:t>11</w:t>
       </w:r>
     </w:p>
     <w:p>
@@ -608,7 +662,7 @@
         </w:rPr>
         <w:t>7 PRÓXIMOS PASSOS</w:t>
         <w:tab/>
-        <w:t>10</w:t>
+        <w:t>11</w:t>
       </w:r>
     </w:p>
     <w:p>
@@ -626,7 +680,7 @@
         </w:rPr>
         <w:t>REFERÊNCIAS</w:t>
         <w:tab/>
-        <w:t>11</w:t>
+        <w:t>13</w:t>
       </w:r>
     </w:p>
     <w:p>
@@ -667,7 +721,7 @@
           <w:b w:val="0"/>
           <w:sz w:val="24"/>
         </w:rPr>
-        <w:t>No 2º turno de 25 de outubro de 2026, a votação foi mantida, por decisão excepcional, até 19h nas seções que ainda funcionavam às 17h. O Tribunal Superior Eleitoral (TSE) informou que 497.333 seções encerraram depois das 17h, 24.268 depois das 17h10 e 6.766 depois das 19h, e que 34.393 votos foram registrados após 17h (BRASIL, 2026a). A margem nacional foi de 4.430.191 votos.</w:t>
+        <w:t>No 2º turno de 25 de outubro de 2026, a votação foi mantida, por decisão excepcional, até 19h nas seções que ainda funcionavam às 17h. O Tribunal Superior Eleitoral (TSE) informou 6.766 seções encerradas depois das 19h e 34.393 votos registrados após 17h, sendo 32.399 entre 17h e 18h, 1.981 entre 18h e 19h e 13 após 19h (BRASIL, 2026a). A margem nacional foi de 4.430.191 votos.</w:t>
       </w:r>
     </w:p>
     <w:p>
@@ -682,7 +736,68 @@
           <w:b w:val="0"/>
           <w:sz w:val="24"/>
         </w:rPr>
-        <w:t>A hipótese que motivou o estudo não se limita aos votos posteriores às 17h. Se um agente com acesso privilegiado (insider) pudesse alterar a contabilização ou os horários registrados, a eventual adulteração atingiria a totalidade dos votos das seções envolvidas. Por isso, a pergunta central é: as seções que permaneceram abertas por mais tempo apresentam, na composição integral de seus votos, diferenças não explicadas por fatores eleitorais e operacionais?</w:t>
+        <w:t>A hipótese que motivou o estudo não se limita aos votos posteriores às 17h: se um agente com acesso privilegiado pudesse alterar a contabilização ou os horários registrados, a adulteração atingiria todos os votos das seções envolvidas. A pergunta deste relatório é, portanto, se as seções que permaneceram abertas por mais tempo diferem, na composição integral de seus votos, das seções comparáveis.</w:t>
+      </w:r>
+    </w:p>
+    <w:p>
+      <w:pPr>
+        <w:pStyle w:val="Heading2"/>
+        <w:spacing w:before="240" w:after="240" w:line="360" w:lineRule="auto"/>
+      </w:pPr>
+      <w:r>
+        <w:rPr>
+          <w:rFonts w:ascii="Arial" w:hAnsi="Arial"/>
+          <w:b/>
+          <w:color w:val="000000"/>
+          <w:sz w:val="24"/>
+        </w:rPr>
+        <w:t>1.1 Escopo e limites deste relatório</w:t>
+      </w:r>
+    </w:p>
+    <w:p>
+      <w:pPr>
+        <w:spacing w:line="360" w:lineRule="auto" w:after="0"/>
+        <w:ind w:firstLine="709"/>
+        <w:jc w:val="both"/>
+      </w:pPr>
+      <w:r>
+        <w:rPr>
+          <w:rFonts w:ascii="Arial" w:hAnsi="Arial"/>
+          <w:b w:val="0"/>
+          <w:sz w:val="24"/>
+        </w:rPr>
+        <w:t xml:space="preserve">Este relatório </w:t>
+      </w:r>
+      <w:r>
+        <w:rPr>
+          <w:rFonts w:ascii="Arial" w:hAnsi="Arial"/>
+          <w:b/>
+          <w:sz w:val="24"/>
+        </w:rPr>
+        <w:t>não</w:t>
+      </w:r>
+      <w:r>
+        <w:rPr>
+          <w:rFonts w:ascii="Arial" w:hAnsi="Arial"/>
+          <w:b w:val="0"/>
+          <w:sz w:val="24"/>
+        </w:rPr>
+        <w:t xml:space="preserve"> constitui auditoria abrangente da eleição presidencial de 2026. Permanecem sem execução nacional: a cadência de votação por minuto ao longo de toda a jornada, as habilitações sem biometria, a análise de abstenção e de votos inválidos por seção, a detecção abrangente de anomalias e os ensaios de segurança (insider e cadeia de suprimentos). Um resultado nulo sobre encerramento tardio não equivale a resultado nulo de uma auditoria de integridade.</w:t>
+      </w:r>
+    </w:p>
+    <w:p>
+      <w:pPr>
+        <w:spacing w:line="360" w:lineRule="auto" w:after="0"/>
+        <w:ind w:firstLine="709"/>
+        <w:jc w:val="both"/>
+      </w:pPr>
+      <w:r>
+        <w:rPr>
+          <w:rFonts w:ascii="Arial" w:hAnsi="Arial"/>
+          <w:b w:val="0"/>
+          <w:sz w:val="24"/>
+        </w:rPr>
+        <w:t>Há também uma limitação de identificabilidade: os testes usam registros produzidos pela própria urna (log, imagem do BU), e a hipótese investigada inclui a possibilidade de comprometimento desses registros. Coerência interna entre esses registros não é prova independente.</w:t>
       </w:r>
     </w:p>
     <w:p>
@@ -728,7 +843,7 @@
           <w:b w:val="0"/>
           <w:sz w:val="24"/>
         </w:rPr>
-        <w:t>, antes da abertura dos microdados do 2º turno de 2026 fora do Tocantins.</w:t>
+        <w:t>. A diretriz metodológica 01, de 30/10/2026, veda o uso de segundos turnos presidenciais como referência de normalidade temporal; nenhum parâmetro deste relatório foi calibrado em turno presidencial: os contrastes são internos ao 2º turno de 2026 e o placebo usa o 2º turno municipal de 2024.</w:t>
       </w:r>
     </w:p>
     <w:p>
@@ -773,7 +888,7 @@
           <w:b w:val="0"/>
           <w:sz w:val="24"/>
         </w:rPr>
-        <w:t>3. Contraste secundário: último voto após 17h10, com o mesmo controle. Os dois contrastes recebem correção de Holm.</w:t>
+        <w:t>3. Contraste secundário: último voto após 17h10, com o mesmo controle. Os dois recebem correção de Holm.</w:t>
       </w:r>
     </w:p>
     <w:p>
@@ -803,7 +918,7 @@
           <w:b w:val="0"/>
           <w:sz w:val="24"/>
         </w:rPr>
-        <w:t>5. O Tocantins fica fora das análises confirmatórias, porque seus microdados foram examinados antes no Estudo 03 (emenda 02). As seções no exterior ficam fora porque lá a votação segue a hora local.</w:t>
+        <w:t>5. O Tocantins fica fora das análises confirmatórias (emenda 02); as seções no exterior também, porque lá a votação segue a hora local.</w:t>
       </w:r>
     </w:p>
     <w:p>
@@ -818,7 +933,7 @@
           <w:b w:val="0"/>
           <w:sz w:val="24"/>
         </w:rPr>
-        <w:t>O encerramento da votação é definido pelo horário do último voto computado no log, e não pelo fechamento da urna, que inclui procedimentos administrativos posteriores (emenda 01). A classificação por fechamento é apresentada como análise exploratória, por corresponder ao critério divulgado pelo TSE.</w:t>
+        <w:t>O encerramento da votação é definido pelo último voto computado no log (emenda 01). A classificação por fechamento é exploratória.</w:t>
       </w:r>
     </w:p>
     <w:p>
@@ -863,7 +978,7 @@
           <w:b w:val="0"/>
           <w:sz w:val="24"/>
         </w:rPr>
-        <w:t xml:space="preserve">Foram usados os arquivos públicos "Arquivos transmitidos para totalização" do 2º turno de 2026 (28 arquivos, 27 unidades da Federação e exterior, 124 GB) e do 2º turno de 2024 (20 unidades da Federação com 2º turno municipal, 51 municípios), obtidos no portal de dados abertos do TSE (BRASIL, 2026b). Para cada arquivo, a URL, a data de gravação e o SHA-256 estão em </w:t>
+        <w:t xml:space="preserve">Arquivos públicos "Arquivos transmitidos para totalização" do 2º turno de 2026 (28 arquivos, 124 GB) e do 2º turno de 2024 (20 unidades da Federação, 51 municípios), além do detalhamento oficial por município e zona de 2026 (BRASIL, 2026b). URL, data de gravação e SHA-256 de cada arquivo constam nos manifestos em </w:t>
       </w:r>
       <w:r>
         <w:rPr>
@@ -871,23 +986,7 @@
           <w:b w:val="0"/>
           <w:sz w:val="24"/>
         </w:rPr>
-        <w:t>resultados/manifesto_arqurna_2T2026.tsv</w:t>
-      </w:r>
-      <w:r>
-        <w:rPr>
-          <w:rFonts w:ascii="Arial" w:hAnsi="Arial"/>
-          <w:b w:val="0"/>
-          <w:sz w:val="24"/>
-        </w:rPr>
-        <w:t xml:space="preserve"> e </w:t>
-      </w:r>
-      <w:r>
-        <w:rPr>
-          <w:rFonts w:ascii="Arial" w:hAnsi="Arial"/>
-          <w:b w:val="0"/>
-          <w:sz w:val="24"/>
-        </w:rPr>
-        <w:t>resultados/manifesto_arqurna_2T2024.tsv</w:t>
+        <w:t>resultados/</w:t>
       </w:r>
       <w:r>
         <w:rPr>
@@ -925,7 +1024,7 @@
           <w:b w:val="0"/>
           <w:sz w:val="24"/>
         </w:rPr>
-        <w:t>De cada seção foram extraídos, da imagem do boletim de urna (BU), o local de votação, o comparecimento e os votos para presidente e governador; e, do log da urna, o primeiro e o último voto computado, o encerramento confirmado, a geração do BU e um histograma de votos por hora. A linha do log que registra o título de eleitor do responsável pelo encerramento não foi copiada. Em Palmas (2024), os votos extraídos da imagem do BU coincidiram com o arquivo oficial de votação por seção em 629 de 629 seções.</w:t>
+        <w:t>De cada seção foram extraídos, da imagem do boletim de urna (BU), o local, o comparecimento e os votos para presidente e governador; e, do log, o primeiro e o último voto computado, o encerramento confirmado, a geração do BU e um histograma de votos por hora. A linha do log com o título de eleitor do responsável pelo encerramento não foi copiada. Em Palmas (2024), os votos da imagem do BU coincidiram com o arquivo oficial por seção em 629 de 629 seções.</w:t>
       </w:r>
     </w:p>
     <w:p>
@@ -940,7 +1039,7 @@
           <w:color w:val="000000"/>
           <w:sz w:val="24"/>
         </w:rPr>
-        <w:t>3.3 Horário de Brasília</w:t>
+        <w:t>3.3 Eventos temporais distintos</w:t>
       </w:r>
     </w:p>
     <w:p>
@@ -955,7 +1054,7 @@
           <w:b w:val="0"/>
           <w:sz w:val="24"/>
         </w:rPr>
-        <w:t>O relógio da urna registra a hora local, enquanto a votação segue o horário de Brasília. A conversão foi feita por município, a partir da hora de abertura mais frequente (8h de Brasília). Exemplo: no Acre, as urnas abriram às 6h locais.</w:t>
+        <w:t>São tratados como eventos diferentes, sem substituição de um pelo outro: último voto no log (relógio interno), encerramento confirmado (transição administrativa), fechamento declarado no BU, geração do BU, impressão, transmissão, recepção central e totalização. Este relatório usa apenas os quatro primeiros, todos do relógio da urna. A recepção central seria referência externa de processamento, mas não do horário do último voto, e não está nos dados abertos.</w:t>
       </w:r>
     </w:p>
     <w:p>
@@ -970,7 +1069,7 @@
           <w:color w:val="000000"/>
           <w:sz w:val="24"/>
         </w:rPr>
-        <w:t>3.4 Verificações de coerência</w:t>
+        <w:t>3.4 Horário de Brasília</w:t>
       </w:r>
     </w:p>
     <w:p>
@@ -985,7 +1084,7 @@
           <w:b w:val="0"/>
           <w:sz w:val="24"/>
         </w:rPr>
-        <w:t>Foram excluídas as seções em que o número de votos no log difere do comparecimento do BU (padrão compatível com substituição de urna), em que fechamento e encerramento confirmado divergem em mais de 2 segundos, ou em que a ordem dos eventos é incompatível. Em 2026, 497.735 das 499.178 seções passaram nas verificações.</w:t>
+        <w:t>O relógio da urna registra a hora local. A conversão foi feita por município, a partir da hora de abertura mais frequente, e confrontada com uma regra externa por unidade da Federação (Acre, -2 h; Amazonas, Rondônia, Roraima, Mato Grosso e Mato Grosso do Sul, -1 h; demais, 0). Dos 5.571 municípios, 12 divergem da regra por UF, e todos pertencem às regiões de exceção conhecidas: 11 no oeste do Amazonas (-2 h) e Fernando de Noronha (+1 h). A lista legal de municípios do oeste do Amazonas em UTC-5 ainda deve ser conferida em fonte normativa.</w:t>
       </w:r>
     </w:p>
     <w:p>
@@ -1000,7 +1099,7 @@
           <w:color w:val="000000"/>
           <w:sz w:val="24"/>
         </w:rPr>
-        <w:t>3.5 Estimador</w:t>
+        <w:t>3.5 Verificações de coerência e população de auditoria</w:t>
       </w:r>
     </w:p>
     <w:p>
@@ -1015,7 +1114,85 @@
           <w:b w:val="0"/>
           <w:sz w:val="24"/>
         </w:rPr>
-        <w:t>Modelo linear ponderado pelos votos válidos, com efeito fixo de local de votação e erro-padrão agrupado por local: a diferença é estimada apenas entre seções do mesmo local, o que neutraliza a composição territorial do eleitorado.</w:t>
+        <w:t xml:space="preserve">Separam-se duas populações. A </w:t>
+      </w:r>
+      <w:r>
+        <w:rPr>
+          <w:rFonts w:ascii="Arial" w:hAnsi="Arial"/>
+          <w:b/>
+          <w:sz w:val="24"/>
+        </w:rPr>
+        <w:t>população estatística</w:t>
+      </w:r>
+      <w:r>
+        <w:rPr>
+          <w:rFonts w:ascii="Arial" w:hAnsi="Arial"/>
+          <w:b w:val="0"/>
+          <w:sz w:val="24"/>
+        </w:rPr>
+        <w:t xml:space="preserve"> reúne as 497.735 seções que passam nas verificações (votos no log iguais ao comparecimento do BU; fechamento e encerramento confirmado com diferença de até 2 segundos; ordem dos eventos). A </w:t>
+      </w:r>
+      <w:r>
+        <w:rPr>
+          <w:rFonts w:ascii="Arial" w:hAnsi="Arial"/>
+          <w:b/>
+          <w:sz w:val="24"/>
+        </w:rPr>
+        <w:t>população de auditoria</w:t>
+      </w:r>
+      <w:r>
+        <w:rPr>
+          <w:rFonts w:ascii="Arial" w:hAnsi="Arial"/>
+          <w:b w:val="0"/>
+          <w:sz w:val="24"/>
+        </w:rPr>
+        <w:t xml:space="preserve"> inclui também as 1.443 seções restantes, inventariadas em </w:t>
+      </w:r>
+      <w:r>
+        <w:rPr>
+          <w:rFonts w:ascii="Arial" w:hAnsi="Arial"/>
+          <w:b w:val="0"/>
+          <w:sz w:val="24"/>
+        </w:rPr>
+        <w:t>resultados/inventario_secoes_incoerentes_2T2026.csv</w:t>
+      </w:r>
+      <w:r>
+        <w:rPr>
+          <w:rFonts w:ascii="Arial" w:hAnsi="Arial"/>
+          <w:b w:val="0"/>
+          <w:sz w:val="24"/>
+        </w:rPr>
+        <w:t>: 1.419 com menos votos no log que no BU (déficit total de 153.492 votos no log), 21 com campos ausentes e 3 com divergência temporal. Em 1.411 das 1.419, o log começa após 8h30, padrão compatível com substituição de urna; 8 permanecem sem explicação. Inconsistência não implica fraude, e a hipótese de substituição ainda não foi verificada nas atas.</w:t>
+      </w:r>
+    </w:p>
+    <w:p>
+      <w:pPr>
+        <w:pStyle w:val="Heading2"/>
+        <w:spacing w:before="240" w:after="240" w:line="360" w:lineRule="auto"/>
+      </w:pPr>
+      <w:r>
+        <w:rPr>
+          <w:rFonts w:ascii="Arial" w:hAnsi="Arial"/>
+          <w:b/>
+          <w:color w:val="000000"/>
+          <w:sz w:val="24"/>
+        </w:rPr>
+        <w:t>3.6 Estimador</w:t>
+      </w:r>
+    </w:p>
+    <w:p>
+      <w:pPr>
+        <w:spacing w:line="360" w:lineRule="auto" w:after="0"/>
+        <w:ind w:firstLine="709"/>
+        <w:jc w:val="both"/>
+      </w:pPr>
+      <w:r>
+        <w:rPr>
+          <w:rFonts w:ascii="Arial" w:hAnsi="Arial"/>
+          <w:b w:val="0"/>
+          <w:sz w:val="24"/>
+        </w:rPr>
+        <w:t>Modelo linear ponderado pelos votos válidos, com efeito fixo de local de votação e erro-padrão agrupado por local.</w:t>
       </w:r>
     </w:p>
     <w:p>
@@ -1301,7 +1478,7 @@
                 <w:b w:val="0"/>
                 <w:sz w:val="20"/>
               </w:rPr>
-              <w:t>Votos registrados após 17h</w:t>
+              <w:t>Comparecimento</w:t>
             </w:r>
           </w:p>
         </w:tc>
@@ -1317,7 +1494,7 @@
                 <w:b w:val="0"/>
                 <w:sz w:val="20"/>
               </w:rPr>
-              <w:t>34.330</w:t>
+              <w:t>128.235.243</w:t>
             </w:r>
           </w:p>
         </w:tc>
@@ -1333,7 +1510,7 @@
                 <w:b w:val="0"/>
                 <w:sz w:val="20"/>
               </w:rPr>
-              <w:t>34.393</w:t>
+              <w:t>128.236.074</w:t>
             </w:r>
           </w:p>
         </w:tc>
@@ -1349,7 +1526,205 @@
                 <w:b w:val="0"/>
                 <w:sz w:val="20"/>
               </w:rPr>
-              <w:t>-63 (0,18%)</w:t>
+              <w:t>-831</w:t>
+            </w:r>
+          </w:p>
+        </w:tc>
+      </w:tr>
+      <w:tr>
+        <w:tc>
+          <w:tcPr>
+            <w:tcW w:type="dxa" w:w="2268"/>
+          </w:tcPr>
+          <w:p>
+            <w:r/>
+            <w:r>
+              <w:rPr>
+                <w:rFonts w:ascii="Arial" w:hAnsi="Arial"/>
+                <w:b w:val="0"/>
+                <w:sz w:val="20"/>
+              </w:rPr>
+              <w:t>Votos entre 17h e 18h</w:t>
+            </w:r>
+          </w:p>
+        </w:tc>
+        <w:tc>
+          <w:tcPr>
+            <w:tcW w:type="dxa" w:w="2268"/>
+          </w:tcPr>
+          <w:p>
+            <w:r/>
+            <w:r>
+              <w:rPr>
+                <w:rFonts w:ascii="Arial" w:hAnsi="Arial"/>
+                <w:b w:val="0"/>
+                <w:sz w:val="20"/>
+              </w:rPr>
+              <w:t>32.337</w:t>
+            </w:r>
+          </w:p>
+        </w:tc>
+        <w:tc>
+          <w:tcPr>
+            <w:tcW w:type="dxa" w:w="2268"/>
+          </w:tcPr>
+          <w:p>
+            <w:r/>
+            <w:r>
+              <w:rPr>
+                <w:rFonts w:ascii="Arial" w:hAnsi="Arial"/>
+                <w:b w:val="0"/>
+                <w:sz w:val="20"/>
+              </w:rPr>
+              <w:t>32.399</w:t>
+            </w:r>
+          </w:p>
+        </w:tc>
+        <w:tc>
+          <w:tcPr>
+            <w:tcW w:type="dxa" w:w="2268"/>
+          </w:tcPr>
+          <w:p>
+            <w:r/>
+            <w:r>
+              <w:rPr>
+                <w:rFonts w:ascii="Arial" w:hAnsi="Arial"/>
+                <w:b w:val="0"/>
+                <w:sz w:val="20"/>
+              </w:rPr>
+              <w:t>-62</w:t>
+            </w:r>
+          </w:p>
+        </w:tc>
+      </w:tr>
+      <w:tr>
+        <w:tc>
+          <w:tcPr>
+            <w:tcW w:type="dxa" w:w="2268"/>
+          </w:tcPr>
+          <w:p>
+            <w:r/>
+            <w:r>
+              <w:rPr>
+                <w:rFonts w:ascii="Arial" w:hAnsi="Arial"/>
+                <w:b w:val="0"/>
+                <w:sz w:val="20"/>
+              </w:rPr>
+              <w:t>Votos entre 18h e 19h</w:t>
+            </w:r>
+          </w:p>
+        </w:tc>
+        <w:tc>
+          <w:tcPr>
+            <w:tcW w:type="dxa" w:w="2268"/>
+          </w:tcPr>
+          <w:p>
+            <w:r/>
+            <w:r>
+              <w:rPr>
+                <w:rFonts w:ascii="Arial" w:hAnsi="Arial"/>
+                <w:b w:val="0"/>
+                <w:sz w:val="20"/>
+              </w:rPr>
+              <w:t>1.982</w:t>
+            </w:r>
+          </w:p>
+        </w:tc>
+        <w:tc>
+          <w:tcPr>
+            <w:tcW w:type="dxa" w:w="2268"/>
+          </w:tcPr>
+          <w:p>
+            <w:r/>
+            <w:r>
+              <w:rPr>
+                <w:rFonts w:ascii="Arial" w:hAnsi="Arial"/>
+                <w:b w:val="0"/>
+                <w:sz w:val="20"/>
+              </w:rPr>
+              <w:t>1.981</w:t>
+            </w:r>
+          </w:p>
+        </w:tc>
+        <w:tc>
+          <w:tcPr>
+            <w:tcW w:type="dxa" w:w="2268"/>
+          </w:tcPr>
+          <w:p>
+            <w:r/>
+            <w:r>
+              <w:rPr>
+                <w:rFonts w:ascii="Arial" w:hAnsi="Arial"/>
+                <w:b w:val="0"/>
+                <w:sz w:val="20"/>
+              </w:rPr>
+              <w:t>+1</w:t>
+            </w:r>
+          </w:p>
+        </w:tc>
+      </w:tr>
+      <w:tr>
+        <w:tc>
+          <w:tcPr>
+            <w:tcW w:type="dxa" w:w="2268"/>
+          </w:tcPr>
+          <w:p>
+            <w:r/>
+            <w:r>
+              <w:rPr>
+                <w:rFonts w:ascii="Arial" w:hAnsi="Arial"/>
+                <w:b w:val="0"/>
+                <w:sz w:val="20"/>
+              </w:rPr>
+              <w:t>Votos após 19h</w:t>
+            </w:r>
+          </w:p>
+        </w:tc>
+        <w:tc>
+          <w:tcPr>
+            <w:tcW w:type="dxa" w:w="2268"/>
+          </w:tcPr>
+          <w:p>
+            <w:r/>
+            <w:r>
+              <w:rPr>
+                <w:rFonts w:ascii="Arial" w:hAnsi="Arial"/>
+                <w:b w:val="0"/>
+                <w:sz w:val="20"/>
+              </w:rPr>
+              <w:t>11</w:t>
+            </w:r>
+          </w:p>
+        </w:tc>
+        <w:tc>
+          <w:tcPr>
+            <w:tcW w:type="dxa" w:w="2268"/>
+          </w:tcPr>
+          <w:p>
+            <w:r/>
+            <w:r>
+              <w:rPr>
+                <w:rFonts w:ascii="Arial" w:hAnsi="Arial"/>
+                <w:b w:val="0"/>
+                <w:sz w:val="20"/>
+              </w:rPr>
+              <w:t>13</w:t>
+            </w:r>
+          </w:p>
+        </w:tc>
+        <w:tc>
+          <w:tcPr>
+            <w:tcW w:type="dxa" w:w="2268"/>
+          </w:tcPr>
+          <w:p>
+            <w:r/>
+            <w:r>
+              <w:rPr>
+                <w:rFonts w:ascii="Arial" w:hAnsi="Arial"/>
+                <w:b w:val="0"/>
+                <w:sz w:val="20"/>
+              </w:rPr>
+              <w:t>-2</w:t>
             </w:r>
           </w:p>
         </w:tc>
@@ -1399,7 +1774,7 @@
                 <w:b w:val="0"/>
                 <w:sz w:val="20"/>
               </w:rPr>
-              <w:t>6.766 (encerramento após 19h)</w:t>
+              <w:t>6.766</w:t>
             </w:r>
           </w:p>
         </w:tc>
@@ -1416,6 +1791,72 @@
                 <w:sz w:val="20"/>
               </w:rPr>
               <w:t>+92</w:t>
+            </w:r>
+          </w:p>
+        </w:tc>
+      </w:tr>
+      <w:tr>
+        <w:tc>
+          <w:tcPr>
+            <w:tcW w:type="dxa" w:w="2268"/>
+          </w:tcPr>
+          <w:p>
+            <w:r/>
+            <w:r>
+              <w:rPr>
+                <w:rFonts w:ascii="Arial" w:hAnsi="Arial"/>
+                <w:b w:val="0"/>
+                <w:sz w:val="20"/>
+              </w:rPr>
+              <w:t>Votos após 17h nessas seções</w:t>
+            </w:r>
+          </w:p>
+        </w:tc>
+        <w:tc>
+          <w:tcPr>
+            <w:tcW w:type="dxa" w:w="2268"/>
+          </w:tcPr>
+          <w:p>
+            <w:r/>
+            <w:r>
+              <w:rPr>
+                <w:rFonts w:ascii="Arial" w:hAnsi="Arial"/>
+                <w:b w:val="0"/>
+                <w:sz w:val="20"/>
+              </w:rPr>
+              <w:t>4.722</w:t>
+            </w:r>
+          </w:p>
+        </w:tc>
+        <w:tc>
+          <w:tcPr>
+            <w:tcW w:type="dxa" w:w="2268"/>
+          </w:tcPr>
+          <w:p>
+            <w:r/>
+            <w:r>
+              <w:rPr>
+                <w:rFonts w:ascii="Arial" w:hAnsi="Arial"/>
+                <w:b w:val="0"/>
+                <w:sz w:val="20"/>
+              </w:rPr>
+              <w:t>4.773</w:t>
+            </w:r>
+          </w:p>
+        </w:tc>
+        <w:tc>
+          <w:tcPr>
+            <w:tcW w:type="dxa" w:w="2268"/>
+          </w:tcPr>
+          <w:p>
+            <w:r/>
+            <w:r>
+              <w:rPr>
+                <w:rFonts w:ascii="Arial" w:hAnsi="Arial"/>
+                <w:b w:val="0"/>
+                <w:sz w:val="20"/>
+              </w:rPr>
+              <w:t>-51</w:t>
             </w:r>
           </w:p>
         </w:tc>
@@ -1445,7 +1886,7 @@
           <w:b w:val="0"/>
           <w:sz w:val="24"/>
         </w:rPr>
-        <w:t>A diferença de 798 votos nos totais (0,0006%) ainda não foi explicada; pode corresponder a seções ausentes dos arquivos transmitidos. As contagens de seções por horário dependem do evento usado como "encerramento", que o TSE não especifica.</w:t>
+        <w:t>A diferença de 831 no comparecimento está inteiramente no exterior (27 zonas): o TSE lista 499.248 seções principais e os arquivos transmitidos contêm 499.178; as 70 seções do exterior ausentes explicam a diferença. As contagens por horário aproximam-se mais das oficiais quando o "encerramento" é a geração do BU do que quando é o fechamento declarado (6.336 seções); o TSE não especifica o evento. A diferença de 2 votos após 19h ainda não foi reconciliada evento por evento.</w:t>
       </w:r>
     </w:p>
     <w:p>
@@ -1605,7 +2046,7 @@
                 <w:b w:val="0"/>
                 <w:sz w:val="20"/>
               </w:rPr>
-              <w:t>Último voto, 2T 2026</w:t>
+              <w:t>Último voto, 2T 2026 (seções)</w:t>
             </w:r>
           </w:p>
         </w:tc>
@@ -1687,7 +2128,7 @@
                 <w:b w:val="0"/>
                 <w:sz w:val="20"/>
               </w:rPr>
-              <w:t>Fechamento da urna, 2T 2026</w:t>
+              <w:t>Fechamento da urna, 2T 2026 (seções)</w:t>
             </w:r>
           </w:p>
         </w:tc>
@@ -1769,7 +2210,7 @@
                 <w:b w:val="0"/>
                 <w:sz w:val="20"/>
               </w:rPr>
-              <w:t>Último voto, 2T municipal 2024</w:t>
+              <w:t>Último voto, 2T municipal 2024 (seções)</w:t>
             </w:r>
           </w:p>
         </w:tc>
@@ -1863,22 +2304,7 @@
           <w:b w:val="0"/>
           <w:sz w:val="24"/>
         </w:rPr>
-        <w:t>Das 6.336 seções que fecharam após 19h, o último voto ocorreu, em mediana, às 16h59 (percentil 90: 18h29). Essas seções permaneceram abertas, em sua maioria, sem receber eleitores. Foram registrados 11 votos após 19h em todo o país. As seções que fecharam após 19h concentram-se no Rio de Janeiro (2.799), em São Paulo (1.567), na Bahia (933), em Pernambuco (657) e na Paraíba (272).</w:t>
-      </w:r>
-    </w:p>
-    <w:p>
-      <w:pPr>
-        <w:spacing w:line="360" w:lineRule="auto" w:after="0"/>
-        <w:ind w:firstLine="709"/>
-        <w:jc w:val="both"/>
-      </w:pPr>
-      <w:r>
-        <w:rPr>
-          <w:rFonts w:ascii="Arial" w:hAnsi="Arial"/>
-          <w:b w:val="0"/>
-          <w:sz w:val="24"/>
-        </w:rPr>
-        <w:t>Comparado ao 2º turno municipal de 2024, o 2º turno de 2026 teve proporção menor de seções com fila após 17h (5,9% contra 10,8%); com a prorrogação, porém, 1.667 seções ainda votaram após 18h, o que não ocorreu em 2024.</w:t>
+        <w:t>Os 11 votos após 19h ocorreram em 11 seções, um em cada (BA, RJ e SP). Das 6.336 seções que fecharam após 19h, o último voto ocorreu, em mediana, às 16h59: a maioria permaneceu aberta sem receber eleitores. Essas seções concentram-se no Rio de Janeiro (2.799), em São Paulo (1.567), na Bahia (933), em Pernambuco (657) e na Paraíba (272). A contagem de votos por hora de 2024 não está disponível, porque a extração de 2024 antecede o campo de histograma; o valor zero que constava da versão 1 era um defeito e foi removido.</w:t>
       </w:r>
     </w:p>
     <w:p>
@@ -1908,7 +2334,7 @@
           <w:b w:val="0"/>
           <w:sz w:val="24"/>
         </w:rPr>
-        <w:t>Sem prorrogação, as seções com fila após 17h não diferiram das demais do mesmo local: -0,07 p.p. (IC 95%: -0,16 a +0,01; 5.242 locais). Não houve seção com último voto após 17h10 em número suficiente para os cortes principais.</w:t>
+        <w:t>Sem prorrogação, as seções com fila após 17h não diferiram significativamente das demais do mesmo local: -0,07 p.p. (IC 95%: -0,16 a +0,01; p = 0,08; 5.242 locais).</w:t>
       </w:r>
     </w:p>
     <w:p>
@@ -2370,6 +2796,104 @@
           </w:p>
         </w:tc>
       </w:tr>
+      <w:tr>
+        <w:tc>
+          <w:tcPr>
+            <w:tcW w:type="dxa" w:w="1512"/>
+          </w:tcPr>
+          <w:p>
+            <w:r/>
+            <w:r>
+              <w:rPr>
+                <w:rFonts w:ascii="Arial" w:hAnsi="Arial"/>
+                <w:b w:val="0"/>
+                <w:sz w:val="20"/>
+              </w:rPr>
+              <w:t>Governador: último voto após 19h</w:t>
+            </w:r>
+          </w:p>
+        </w:tc>
+        <w:tc>
+          <w:tcPr>
+            <w:tcW w:type="dxa" w:w="1512"/>
+          </w:tcPr>
+          <w:p>
+            <w:r/>
+            <w:r>
+              <w:rPr>
+                <w:rFonts w:ascii="Arial" w:hAnsi="Arial"/>
+                <w:b w:val="0"/>
+                <w:sz w:val="20"/>
+              </w:rPr>
+              <w:t>não estimável</w:t>
+            </w:r>
+          </w:p>
+        </w:tc>
+        <w:tc>
+          <w:tcPr>
+            <w:tcW w:type="dxa" w:w="1512"/>
+          </w:tcPr>
+          <w:p>
+            <w:r/>
+            <w:r>
+              <w:rPr>
+                <w:rFonts w:ascii="Arial" w:hAnsi="Arial"/>
+                <w:b w:val="0"/>
+                <w:sz w:val="20"/>
+              </w:rPr>
+              <w:t>-</w:t>
+            </w:r>
+          </w:p>
+        </w:tc>
+        <w:tc>
+          <w:tcPr>
+            <w:tcW w:type="dxa" w:w="1512"/>
+          </w:tcPr>
+          <w:p>
+            <w:r/>
+            <w:r>
+              <w:rPr>
+                <w:rFonts w:ascii="Arial" w:hAnsi="Arial"/>
+                <w:b w:val="0"/>
+                <w:sz w:val="20"/>
+              </w:rPr>
+              <w:t>-</w:t>
+            </w:r>
+          </w:p>
+        </w:tc>
+        <w:tc>
+          <w:tcPr>
+            <w:tcW w:type="dxa" w:w="1512"/>
+          </w:tcPr>
+          <w:p>
+            <w:r/>
+            <w:r>
+              <w:rPr>
+                <w:rFonts w:ascii="Arial" w:hAnsi="Arial"/>
+                <w:b w:val="0"/>
+                <w:sz w:val="20"/>
+              </w:rPr>
+              <w:t>-</w:t>
+            </w:r>
+          </w:p>
+        </w:tc>
+        <w:tc>
+          <w:tcPr>
+            <w:tcW w:type="dxa" w:w="1512"/>
+          </w:tcPr>
+          <w:p>
+            <w:r/>
+            <w:r>
+              <w:rPr>
+                <w:rFonts w:ascii="Arial" w:hAnsi="Arial"/>
+                <w:b w:val="0"/>
+                <w:sz w:val="20"/>
+              </w:rPr>
+              <w:t>0</w:t>
+            </w:r>
+          </w:p>
+        </w:tc>
+      </w:tr>
     </w:tbl>
     <w:p>
       <w:pPr>
@@ -2395,7 +2919,7 @@
           <w:b w:val="0"/>
           <w:sz w:val="24"/>
         </w:rPr>
-        <w:t>Nenhum contraste confirmatório rejeitou a hipótese nula. O contraste primário é estimável, mas tem poder muito baixo, porque apenas 11 seções votaram após 19h. O contraste de calibração tem sinal e magnitude semelhantes aos do placebo de 2024 (-0,07 p.p.), o que indica um efeito estrutural pequeno das seções com fila, presente sem prorrogação, e não um efeito associado à extensão.</w:t>
+        <w:t>Os contrastes confirmatórios não identificaram associação estatisticamente significativa. O primário tem poder muito baixo (11 seções). O contraste de calibração, fora da família confirmatória, identificou efeito muito pequeno e estatisticamente detectável, de magnitude semelhante à do placebo de 2024 (-0,07 p.p.), o que sugere característica estrutural das seções com fila, e não efeito da prorrogação; essa leitura é uma interpretação, não um teste. O contraste do governador após 19h não foi estimável, por ausência de locais com seções tratadas.</w:t>
       </w:r>
     </w:p>
     <w:p>
@@ -2744,7 +3268,7 @@
           <w:b w:val="0"/>
           <w:sz w:val="24"/>
         </w:rPr>
-        <w:t>O contraste com fechamento após 19h corresponde ao critério divulgado pelo TSE e abrange todos os votos das seções que permaneceram abertas até 19h. Não houve diferença.</w:t>
+        <w:t>Nenhum desses contrastes foi estatisticamente significativo.</w:t>
       </w:r>
     </w:p>
     <w:p>
@@ -2759,7 +3283,7 @@
           <w:color w:val="000000"/>
           <w:sz w:val="24"/>
         </w:rPr>
-        <w:t>4.6 Por que a comparação bruta engana</w:t>
+        <w:t>4.6 Comparação bruta e comparação dentro do local</w:t>
       </w:r>
     </w:p>
     <w:p>
@@ -2774,7 +3298,7 @@
           <w:b w:val="0"/>
           <w:sz w:val="24"/>
         </w:rPr>
-        <w:t>Nas seções que fecharam após 19h, o candidato 13 obteve 55,2% dos votos válidos; nas demais, 51,7%. A diferença bruta, de 3,5 p.p., desaparece na comparação dentro do local de votação (-0,04 p.p.). Ela decorre da localização dessas seções, concentradas em regiões metropolitanas de RJ, SP, BA e PE, e não do horário de encerramento.</w:t>
+        <w:t>Nas seções que fecharam após 19h, o candidato 13 obteve 55,2% dos votos válidos; nas demais, 51,7%. A diferença bruta, de 3,5 p.p., desaparece na comparação dentro do local de votação (-0,04 p.p.), o que indica que decorre da localização dessas seções.</w:t>
       </w:r>
     </w:p>
     <w:p>
@@ -2924,7 +3448,7 @@
                 <w:b w:val="0"/>
                 <w:sz w:val="20"/>
               </w:rPr>
-              <w:t>677 vezes o total da coorte (impossível)</w:t>
+              <w:t>677 vezes o total da coorte</w:t>
             </w:r>
           </w:p>
         </w:tc>
@@ -2974,7 +3498,7 @@
                 <w:b w:val="0"/>
                 <w:sz w:val="20"/>
               </w:rPr>
-              <w:t>2,63 vezes (impossível)</w:t>
+              <w:t>2,63 vezes</w:t>
             </w:r>
           </w:p>
         </w:tc>
@@ -3024,7 +3548,7 @@
                 <w:b w:val="0"/>
                 <w:sz w:val="20"/>
               </w:rPr>
-              <w:t>1,24 vez (impossível)</w:t>
+              <w:t>1,24 vez</w:t>
             </w:r>
           </w:p>
         </w:tc>
@@ -3104,7 +3628,7 @@
           <w:b w:val="0"/>
           <w:sz w:val="24"/>
         </w:rPr>
-        <w:t>Nem a transferência integral dos votos das seções que permaneceram abertas até 19h alteraria o resultado. Uma alteração dessa ordem nas seções com fila (28,5%) seria incompatível com as diferenças observadas, da ordem de 0,05 p.p.</w:t>
+        <w:t>Uma transferência de votos exclusivamente entre os dois finalistas, limitada aos votos válidos registrados nas seções identificadas como tardias pelo critério utilizado, não seria suficiente para inverter a margem nacional nas três primeiras coortes. Esse limite vale apenas para esse mecanismo: não exclui alterações distribuídas entre seções de outros horários nem comprometimento anterior à geração do BU, e a própria classificação das coortes depende do relógio da urna.</w:t>
       </w:r>
     </w:p>
     <w:p>
@@ -3119,7 +3643,524 @@
           <w:color w:val="000000"/>
           <w:sz w:val="24"/>
         </w:rPr>
-        <w:t>4.8 Estudo 03: hipótese do mesário (piloto no Tocantins)</w:t>
+        <w:t>4.8 Abstenção e votos inválidos entre os turnos</w:t>
+      </w:r>
+    </w:p>
+    <w:p>
+      <w:pPr>
+        <w:spacing w:before="120"/>
+        <w:jc w:val="center"/>
+      </w:pPr>
+      <w:r>
+        <w:rPr>
+          <w:rFonts w:ascii="Arial" w:hAnsi="Arial"/>
+          <w:sz w:val="20"/>
+        </w:rPr>
+        <w:t>Tabela 6 - Abstenção e votos inválidos entre os turnos</w:t>
+      </w:r>
+    </w:p>
+    <w:tbl>
+      <w:tblPr>
+        <w:tblStyle w:val="TableGrid"/>
+        <w:tblW w:type="auto" w:w="0"/>
+        <w:jc w:val="center"/>
+        <w:tblLook w:firstColumn="1" w:firstRow="1" w:lastColumn="0" w:lastRow="0" w:noHBand="0" w:noVBand="1" w:val="04A0"/>
+      </w:tblPr>
+      <w:tblGrid>
+        <w:gridCol w:w="2268"/>
+        <w:gridCol w:w="2268"/>
+        <w:gridCol w:w="2268"/>
+        <w:gridCol w:w="2268"/>
+      </w:tblGrid>
+      <w:tr>
+        <w:tc>
+          <w:tcPr>
+            <w:tcW w:type="dxa" w:w="2268"/>
+          </w:tcPr>
+          <w:p>
+            <w:r>
+              <w:rPr>
+                <w:b/>
+              </w:rPr>
+            </w:r>
+            <w:r>
+              <w:rPr>
+                <w:rFonts w:ascii="Arial" w:hAnsi="Arial"/>
+                <w:b/>
+                <w:sz w:val="20"/>
+              </w:rPr>
+              <w:t>Indicador</w:t>
+            </w:r>
+          </w:p>
+        </w:tc>
+        <w:tc>
+          <w:tcPr>
+            <w:tcW w:type="dxa" w:w="2268"/>
+          </w:tcPr>
+          <w:p>
+            <w:r>
+              <w:rPr>
+                <w:b/>
+              </w:rPr>
+            </w:r>
+            <w:r>
+              <w:rPr>
+                <w:rFonts w:ascii="Arial" w:hAnsi="Arial"/>
+                <w:b/>
+                <w:sz w:val="20"/>
+              </w:rPr>
+              <w:t>1º turno</w:t>
+            </w:r>
+          </w:p>
+        </w:tc>
+        <w:tc>
+          <w:tcPr>
+            <w:tcW w:type="dxa" w:w="2268"/>
+          </w:tcPr>
+          <w:p>
+            <w:r>
+              <w:rPr>
+                <w:b/>
+              </w:rPr>
+            </w:r>
+            <w:r>
+              <w:rPr>
+                <w:rFonts w:ascii="Arial" w:hAnsi="Arial"/>
+                <w:b/>
+                <w:sz w:val="20"/>
+              </w:rPr>
+              <w:t>2º turno</w:t>
+            </w:r>
+          </w:p>
+        </w:tc>
+        <w:tc>
+          <w:tcPr>
+            <w:tcW w:type="dxa" w:w="2268"/>
+          </w:tcPr>
+          <w:p>
+            <w:r>
+              <w:rPr>
+                <w:b/>
+              </w:rPr>
+            </w:r>
+            <w:r>
+              <w:rPr>
+                <w:rFonts w:ascii="Arial" w:hAnsi="Arial"/>
+                <w:b/>
+                <w:sz w:val="20"/>
+              </w:rPr>
+              <w:t>Variação</w:t>
+            </w:r>
+          </w:p>
+        </w:tc>
+      </w:tr>
+      <w:tr>
+        <w:tc>
+          <w:tcPr>
+            <w:tcW w:type="dxa" w:w="2268"/>
+          </w:tcPr>
+          <w:p>
+            <w:r/>
+            <w:r>
+              <w:rPr>
+                <w:rFonts w:ascii="Arial" w:hAnsi="Arial"/>
+                <w:b w:val="0"/>
+                <w:sz w:val="20"/>
+              </w:rPr>
+              <w:t>Comparecimento</w:t>
+            </w:r>
+          </w:p>
+        </w:tc>
+        <w:tc>
+          <w:tcPr>
+            <w:tcW w:type="dxa" w:w="2268"/>
+          </w:tcPr>
+          <w:p>
+            <w:r/>
+            <w:r>
+              <w:rPr>
+                <w:rFonts w:ascii="Arial" w:hAnsi="Arial"/>
+                <w:b w:val="0"/>
+                <w:sz w:val="20"/>
+              </w:rPr>
+              <w:t>125.275.835</w:t>
+            </w:r>
+          </w:p>
+        </w:tc>
+        <w:tc>
+          <w:tcPr>
+            <w:tcW w:type="dxa" w:w="2268"/>
+          </w:tcPr>
+          <w:p>
+            <w:r/>
+            <w:r>
+              <w:rPr>
+                <w:rFonts w:ascii="Arial" w:hAnsi="Arial"/>
+                <w:b w:val="0"/>
+                <w:sz w:val="20"/>
+              </w:rPr>
+              <w:t>128.236.074</w:t>
+            </w:r>
+          </w:p>
+        </w:tc>
+        <w:tc>
+          <w:tcPr>
+            <w:tcW w:type="dxa" w:w="2268"/>
+          </w:tcPr>
+          <w:p>
+            <w:r/>
+            <w:r>
+              <w:rPr>
+                <w:rFonts w:ascii="Arial" w:hAnsi="Arial"/>
+                <w:b w:val="0"/>
+                <w:sz w:val="20"/>
+              </w:rPr>
+              <w:t>+2.960.239</w:t>
+            </w:r>
+          </w:p>
+        </w:tc>
+      </w:tr>
+      <w:tr>
+        <w:tc>
+          <w:tcPr>
+            <w:tcW w:type="dxa" w:w="2268"/>
+          </w:tcPr>
+          <w:p>
+            <w:r/>
+            <w:r>
+              <w:rPr>
+                <w:rFonts w:ascii="Arial" w:hAnsi="Arial"/>
+                <w:b w:val="0"/>
+                <w:sz w:val="20"/>
+              </w:rPr>
+              <w:t>Abstenção</w:t>
+            </w:r>
+          </w:p>
+        </w:tc>
+        <w:tc>
+          <w:tcPr>
+            <w:tcW w:type="dxa" w:w="2268"/>
+          </w:tcPr>
+          <w:p>
+            <w:r/>
+            <w:r>
+              <w:rPr>
+                <w:rFonts w:ascii="Arial" w:hAnsi="Arial"/>
+                <w:b w:val="0"/>
+                <w:sz w:val="20"/>
+              </w:rPr>
+              <w:t>33.469.244 (21,08%)</w:t>
+            </w:r>
+          </w:p>
+        </w:tc>
+        <w:tc>
+          <w:tcPr>
+            <w:tcW w:type="dxa" w:w="2268"/>
+          </w:tcPr>
+          <w:p>
+            <w:r/>
+            <w:r>
+              <w:rPr>
+                <w:rFonts w:ascii="Arial" w:hAnsi="Arial"/>
+                <w:b w:val="0"/>
+                <w:sz w:val="20"/>
+              </w:rPr>
+              <w:t>30.509.005 (19,22%)</w:t>
+            </w:r>
+          </w:p>
+        </w:tc>
+        <w:tc>
+          <w:tcPr>
+            <w:tcW w:type="dxa" w:w="2268"/>
+          </w:tcPr>
+          <w:p>
+            <w:r/>
+            <w:r>
+              <w:rPr>
+                <w:rFonts w:ascii="Arial" w:hAnsi="Arial"/>
+                <w:b w:val="0"/>
+                <w:sz w:val="20"/>
+              </w:rPr>
+              <w:t>-1,86 p.p.</w:t>
+            </w:r>
+          </w:p>
+        </w:tc>
+      </w:tr>
+      <w:tr>
+        <w:tc>
+          <w:tcPr>
+            <w:tcW w:type="dxa" w:w="2268"/>
+          </w:tcPr>
+          <w:p>
+            <w:r/>
+            <w:r>
+              <w:rPr>
+                <w:rFonts w:ascii="Arial" w:hAnsi="Arial"/>
+                <w:b w:val="0"/>
+                <w:sz w:val="20"/>
+              </w:rPr>
+              <w:t>Brancos e nulos</w:t>
+            </w:r>
+          </w:p>
+        </w:tc>
+        <w:tc>
+          <w:tcPr>
+            <w:tcW w:type="dxa" w:w="2268"/>
+          </w:tcPr>
+          <w:p>
+            <w:r/>
+            <w:r>
+              <w:rPr>
+                <w:rFonts w:ascii="Arial" w:hAnsi="Arial"/>
+                <w:b w:val="0"/>
+                <w:sz w:val="20"/>
+              </w:rPr>
+              <w:t>5.975.047</w:t>
+            </w:r>
+          </w:p>
+        </w:tc>
+        <w:tc>
+          <w:tcPr>
+            <w:tcW w:type="dxa" w:w="2268"/>
+          </w:tcPr>
+          <w:p>
+            <w:r/>
+            <w:r>
+              <w:rPr>
+                <w:rFonts w:ascii="Arial" w:hAnsi="Arial"/>
+                <w:b w:val="0"/>
+                <w:sz w:val="20"/>
+              </w:rPr>
+              <w:t>4.153.801</w:t>
+            </w:r>
+          </w:p>
+        </w:tc>
+        <w:tc>
+          <w:tcPr>
+            <w:tcW w:type="dxa" w:w="2268"/>
+          </w:tcPr>
+          <w:p>
+            <w:r/>
+            <w:r>
+              <w:rPr>
+                <w:rFonts w:ascii="Arial" w:hAnsi="Arial"/>
+                <w:b w:val="0"/>
+                <w:sz w:val="20"/>
+              </w:rPr>
+              <w:t>-1.821.246</w:t>
+            </w:r>
+          </w:p>
+        </w:tc>
+      </w:tr>
+      <w:tr>
+        <w:tc>
+          <w:tcPr>
+            <w:tcW w:type="dxa" w:w="2268"/>
+          </w:tcPr>
+          <w:p>
+            <w:r/>
+            <w:r>
+              <w:rPr>
+                <w:rFonts w:ascii="Arial" w:hAnsi="Arial"/>
+                <w:b w:val="0"/>
+                <w:sz w:val="20"/>
+              </w:rPr>
+              <w:t>Lula (13)</w:t>
+            </w:r>
+          </w:p>
+        </w:tc>
+        <w:tc>
+          <w:tcPr>
+            <w:tcW w:type="dxa" w:w="2268"/>
+          </w:tcPr>
+          <w:p>
+            <w:r/>
+            <w:r>
+              <w:rPr>
+                <w:rFonts w:ascii="Arial" w:hAnsi="Arial"/>
+                <w:b w:val="0"/>
+                <w:sz w:val="20"/>
+              </w:rPr>
+              <w:t>53.879.538</w:t>
+            </w:r>
+          </w:p>
+        </w:tc>
+        <w:tc>
+          <w:tcPr>
+            <w:tcW w:type="dxa" w:w="2268"/>
+          </w:tcPr>
+          <w:p>
+            <w:r/>
+            <w:r>
+              <w:rPr>
+                <w:rFonts w:ascii="Arial" w:hAnsi="Arial"/>
+                <w:b w:val="0"/>
+                <w:sz w:val="20"/>
+              </w:rPr>
+              <w:t>64.256.232</w:t>
+            </w:r>
+          </w:p>
+        </w:tc>
+        <w:tc>
+          <w:tcPr>
+            <w:tcW w:type="dxa" w:w="2268"/>
+          </w:tcPr>
+          <w:p>
+            <w:r/>
+            <w:r>
+              <w:rPr>
+                <w:rFonts w:ascii="Arial" w:hAnsi="Arial"/>
+                <w:b w:val="0"/>
+                <w:sz w:val="20"/>
+              </w:rPr>
+              <w:t>+10.376.694</w:t>
+            </w:r>
+          </w:p>
+        </w:tc>
+      </w:tr>
+      <w:tr>
+        <w:tc>
+          <w:tcPr>
+            <w:tcW w:type="dxa" w:w="2268"/>
+          </w:tcPr>
+          <w:p>
+            <w:r/>
+            <w:r>
+              <w:rPr>
+                <w:rFonts w:ascii="Arial" w:hAnsi="Arial"/>
+                <w:b w:val="0"/>
+                <w:sz w:val="20"/>
+              </w:rPr>
+              <w:t>Flávio (22)</w:t>
+            </w:r>
+          </w:p>
+        </w:tc>
+        <w:tc>
+          <w:tcPr>
+            <w:tcW w:type="dxa" w:w="2268"/>
+          </w:tcPr>
+          <w:p>
+            <w:r/>
+            <w:r>
+              <w:rPr>
+                <w:rFonts w:ascii="Arial" w:hAnsi="Arial"/>
+                <w:b w:val="0"/>
+                <w:sz w:val="20"/>
+              </w:rPr>
+              <w:t>56.104.503</w:t>
+            </w:r>
+          </w:p>
+        </w:tc>
+        <w:tc>
+          <w:tcPr>
+            <w:tcW w:type="dxa" w:w="2268"/>
+          </w:tcPr>
+          <w:p>
+            <w:r/>
+            <w:r>
+              <w:rPr>
+                <w:rFonts w:ascii="Arial" w:hAnsi="Arial"/>
+                <w:b w:val="0"/>
+                <w:sz w:val="20"/>
+              </w:rPr>
+              <w:t>59.826.041</w:t>
+            </w:r>
+          </w:p>
+        </w:tc>
+        <w:tc>
+          <w:tcPr>
+            <w:tcW w:type="dxa" w:w="2268"/>
+          </w:tcPr>
+          <w:p>
+            <w:r/>
+            <w:r>
+              <w:rPr>
+                <w:rFonts w:ascii="Arial" w:hAnsi="Arial"/>
+                <w:b w:val="0"/>
+                <w:sz w:val="20"/>
+              </w:rPr>
+              <w:t>+3.721.538</w:t>
+            </w:r>
+          </w:p>
+        </w:tc>
+      </w:tr>
+      <w:tr>
+        <w:tc>
+          <w:tcPr>
+            <w:tcW w:type="dxa" w:w="2268"/>
+          </w:tcPr>
+          <w:p>
+            <w:r/>
+            <w:r>
+              <w:rPr>
+                <w:rFonts w:ascii="Arial" w:hAnsi="Arial"/>
+                <w:b w:val="0"/>
+                <w:sz w:val="20"/>
+              </w:rPr>
+              <w:t>Votos dos eliminados</w:t>
+            </w:r>
+          </w:p>
+        </w:tc>
+        <w:tc>
+          <w:tcPr>
+            <w:tcW w:type="dxa" w:w="2268"/>
+          </w:tcPr>
+          <w:p>
+            <w:r/>
+            <w:r>
+              <w:rPr>
+                <w:rFonts w:ascii="Arial" w:hAnsi="Arial"/>
+                <w:b w:val="0"/>
+                <w:sz w:val="20"/>
+              </w:rPr>
+              <w:t>9.316.747</w:t>
+            </w:r>
+          </w:p>
+        </w:tc>
+        <w:tc>
+          <w:tcPr>
+            <w:tcW w:type="dxa" w:w="2268"/>
+          </w:tcPr>
+          <w:p>
+            <w:r/>
+            <w:r>
+              <w:rPr>
+                <w:rFonts w:ascii="Arial" w:hAnsi="Arial"/>
+                <w:b w:val="0"/>
+                <w:sz w:val="20"/>
+              </w:rPr>
+              <w:t>-</w:t>
+            </w:r>
+          </w:p>
+        </w:tc>
+        <w:tc>
+          <w:tcPr>
+            <w:tcW w:type="dxa" w:w="2268"/>
+          </w:tcPr>
+          <w:p>
+            <w:r/>
+            <w:r>
+              <w:rPr>
+                <w:rFonts w:ascii="Arial" w:hAnsi="Arial"/>
+                <w:b w:val="0"/>
+                <w:sz w:val="20"/>
+              </w:rPr>
+              <w:t>-</w:t>
+            </w:r>
+          </w:p>
+        </w:tc>
+      </w:tr>
+    </w:tbl>
+    <w:p>
+      <w:pPr>
+        <w:spacing w:after="240"/>
+      </w:pPr>
+      <w:r>
+        <w:rPr>
+          <w:rFonts w:ascii="Arial" w:hAnsi="Arial"/>
+          <w:sz w:val="20"/>
+        </w:rPr>
+        <w:t>Fonte: elaboração própria, com dados abertos do TSE.</w:t>
       </w:r>
     </w:p>
     <w:p>
@@ -3134,7 +4175,37 @@
           <w:b w:val="0"/>
           <w:sz w:val="24"/>
         </w:rPr>
-        <w:t>No Tocantins, nenhuma hipótese da família pré-registrada foi sustentada (q = 1,0 em todos os testes). O excesso de habilitações sem biometria no fim do dia foi menor em 2026 do que em 2022, nenhuma seção apresentou duas ou mais rajadas de habilitações e a última habilitação do 2º turno de 2026 ocorreu às 17h11. O resultado vale para inserções a partir de cerca de 10 habilitações sem biometria por seção. Fora do Tocantins, o Estudo 03 passou a exploratório.</w:t>
+        <w:t>Fonte dos números: detalhamento oficial por município e zona do TSE. A identidade contábil fecha: o crescimento conjunto dos finalistas (14.098.232) é igual à soma dos votos dos eliminados (9.316.747), do aumento do comparecimento (2.960.239) e da redução de brancos e nulos (1.821.246). O fechamento contábil não explica comportamento: não identifica quais eleitores mudaram de candidato nem quem deixou de se abster. Uma regressão ecológica exploratória por município produziu coeficientes fora do intervalo admissível (por exemplo, 1,42 e -0,21), o que mostra que o modelo linear simples é inadequado para estimar transferências; a inferência ecológica apropriada fica para o Estudo 02.</w:t>
+      </w:r>
+    </w:p>
+    <w:p>
+      <w:pPr>
+        <w:pStyle w:val="Heading2"/>
+        <w:spacing w:before="240" w:after="240" w:line="360" w:lineRule="auto"/>
+      </w:pPr>
+      <w:r>
+        <w:rPr>
+          <w:rFonts w:ascii="Arial" w:hAnsi="Arial"/>
+          <w:b/>
+          <w:color w:val="000000"/>
+          <w:sz w:val="24"/>
+        </w:rPr>
+        <w:t>4.9 Estudo 03: hipótese do mesário (piloto no Tocantins)</w:t>
+      </w:r>
+    </w:p>
+    <w:p>
+      <w:pPr>
+        <w:spacing w:line="360" w:lineRule="auto" w:after="0"/>
+        <w:ind w:firstLine="709"/>
+        <w:jc w:val="both"/>
+      </w:pPr>
+      <w:r>
+        <w:rPr>
+          <w:rFonts w:ascii="Arial" w:hAnsi="Arial"/>
+          <w:b w:val="0"/>
+          <w:sz w:val="24"/>
+        </w:rPr>
+        <w:t>No Tocantins, nenhum teste da família pré-registrada rejeitou a hipótese nula (q = 1,0). Pela diretriz metodológica 01, porém, os componentes que usam o 2º turno presidencial de 2022 como referência (H1a e o diagnóstico de poder) passam a descritivos, e a conclusão desse piloto não pode ser apresentada como teste contra referência independente. Fora do Tocantins, o Estudo 03 é exploratório.</w:t>
       </w:r>
     </w:p>
     <w:p>
@@ -3164,7 +4235,7 @@
           <w:b w:val="0"/>
           <w:sz w:val="24"/>
         </w:rPr>
-        <w:t>1. Os horários provêm do relógio da urna. Um relógio incorreto, ou um software que registrasse horários falsos, produziria registros coerentes entre si e passaria em todas as verificações internas.</w:t>
+        <w:t>1. Identificabilidade: os testes usam registros da própria urna; um relógio incorreto, ou um software que registrasse horários ou votos falsos de forma coerente, passaria em todas as verificações internas.</w:t>
       </w:r>
     </w:p>
     <w:p>
@@ -3179,7 +4250,7 @@
           <w:b w:val="0"/>
           <w:sz w:val="24"/>
         </w:rPr>
-        <w:t>2. O desenho compara seções tardias com seções do mesmo local. Um comprometimento uniforme do software, que afetasse todas as urnas igualmente, não seria detectado por esse contraste.</w:t>
+        <w:t>2. Comprometimento uniforme do software, que afetasse todas as urnas igualmente, não é detectável pelo contraste dentro do local.</w:t>
       </w:r>
     </w:p>
     <w:p>
@@ -3194,7 +4265,7 @@
           <w:b w:val="0"/>
           <w:sz w:val="24"/>
         </w:rPr>
-        <w:t>3. A conciliação entre BU e totalização foi feita no agregado nacional (diferença de 798 votos) e não por seção contra cópias independentes do BU.</w:t>
+        <w:t>3. A conciliação entre BU e totalização foi feita por zona e no agregado nacional, não por seção contra cópias independentes do BU.</w:t>
       </w:r>
     </w:p>
     <w:p>
@@ -3209,7 +4280,7 @@
           <w:b w:val="0"/>
           <w:sz w:val="24"/>
         </w:rPr>
-        <w:t>4. O contraste primário (após 19h) tem poder muito baixo, porque o fenômeno quase não ocorreu: 11 seções.</w:t>
+        <w:t>4. O contraste primário tem poder muito baixo, porque o fenômeno quase não ocorreu (11 seções).</w:t>
       </w:r>
     </w:p>
     <w:p>
@@ -3239,7 +4310,37 @@
           <w:b w:val="0"/>
           <w:sz w:val="24"/>
         </w:rPr>
-        <w:t>6. O pré-registro foi redigido após o conhecimento dos agregados nacionais; o caráter prospectivo limita-se aos microdados por seção.</w:t>
+        <w:t>6. As 1.443 seções da população de auditoria foram excluídas dos contrastes; a causa de 8 delas não foi identificada.</w:t>
+      </w:r>
+    </w:p>
+    <w:p>
+      <w:pPr>
+        <w:spacing w:line="360" w:lineRule="auto" w:after="0"/>
+        <w:ind w:firstLine="709"/>
+        <w:jc w:val="both"/>
+      </w:pPr>
+      <w:r>
+        <w:rPr>
+          <w:rFonts w:ascii="Arial" w:hAnsi="Arial"/>
+          <w:b w:val="0"/>
+          <w:sz w:val="24"/>
+        </w:rPr>
+        <w:t>7. A cadência por minuto, as habilitações sem biometria em escala nacional e a calibração temporal pelos grupos de referência da diretriz 01 não foram executadas.</w:t>
+      </w:r>
+    </w:p>
+    <w:p>
+      <w:pPr>
+        <w:spacing w:line="360" w:lineRule="auto" w:after="0"/>
+        <w:ind w:firstLine="709"/>
+        <w:jc w:val="both"/>
+      </w:pPr>
+      <w:r>
+        <w:rPr>
+          <w:rFonts w:ascii="Arial" w:hAnsi="Arial"/>
+          <w:b w:val="0"/>
+          <w:sz w:val="24"/>
+        </w:rPr>
+        <w:t>8. O pré-registro foi redigido após o conhecimento dos agregados nacionais; o caráter prospectivo limita-se aos microdados por seção.</w:t>
       </w:r>
     </w:p>
     <w:p>
@@ -3269,7 +4370,7 @@
           <w:b w:val="0"/>
           <w:sz w:val="24"/>
         </w:rPr>
-        <w:t>1. Os dados públicos de urna reproduzem os totais oficiais e as contagens divulgadas pelo TSE.</w:t>
+        <w:t>1. Os dados públicos de urna reproduzem os totais oficiais; a diferença de 798 votos é explicada por 70 seções do exterior ausentes dos arquivos transmitidos.</w:t>
       </w:r>
     </w:p>
     <w:p>
@@ -3284,7 +4385,7 @@
           <w:b w:val="0"/>
           <w:sz w:val="24"/>
         </w:rPr>
-        <w:t>2. A prorrogação até 19h quase não gerou votação: 6.336 seções permaneceram abertas, mas apenas 11 votos foram registrados após 19h.</w:t>
+        <w:t>2. A prorrogação até 19h gerou pouca votação: 11 votos após 19h nos dados extraídos (13 segundo o TSE), em seções que, na maioria, ficaram abertas sem eleitores.</w:t>
       </w:r>
     </w:p>
     <w:p>
@@ -3299,7 +4400,7 @@
           <w:b w:val="0"/>
           <w:sz w:val="24"/>
         </w:rPr>
-        <w:t>3. Em nenhum contraste, pré-registrado ou exploratório, as seções de encerramento tardio diferiram, na composição integral de seus votos, das seções do mesmo local.</w:t>
+        <w:t>3. Os contrastes confirmatórios não identificaram associação estatisticamente significativa entre encerramento tardio e composição dos votos; o contraste de calibração identificou efeito muito pequeno, semelhante ao do placebo; o contraste do governador após 19h não foi estimável.</w:t>
       </w:r>
     </w:p>
     <w:p>
@@ -3314,7 +4415,7 @@
           <w:b w:val="0"/>
           <w:sz w:val="24"/>
         </w:rPr>
-        <w:t>4. A diferença bruta de 3,5 p.p. nas seções abertas até 19h é explicada pela geografia.</w:t>
+        <w:t>4. A diferença bruta de 3,5 p.p. nas seções abertas até 19h é compatível com a localização dessas seções.</w:t>
       </w:r>
     </w:p>
     <w:p>
@@ -3329,7 +4430,7 @@
           <w:b w:val="0"/>
           <w:sz w:val="24"/>
         </w:rPr>
-        <w:t>5. Nenhuma alteração restrita às seções de encerramento tardio poderia ter invertido o resultado.</w:t>
+        <w:t>5. Uma transferência entre os dois finalistas restrita às coortes tardias, tal como classificadas, não alcançaria a margem nacional.</w:t>
       </w:r>
     </w:p>
     <w:p>
@@ -3344,7 +4445,7 @@
           <w:b w:val="0"/>
           <w:sz w:val="24"/>
         </w:rPr>
-        <w:t>6. Essas conclusões não demonstram a ausência de qualquer adulteração. Elas afastam, com os dados públicos e sob a hipótese de relógio correto, a hipótese de que a prorrogação tenha sido usada para alterar os votos das seções envolvidas.</w:t>
+        <w:t>6. Essas conclusões dizem respeito ao encerramento tardio, sob a hipótese de registros corretos da urna. A hipótese de comportamento temporal atípico nas eleições presidenciais permanece não testada de forma abrangente diante do paradigma histórico definido na diretriz 01.</w:t>
       </w:r>
     </w:p>
     <w:p>
@@ -3374,7 +4475,7 @@
           <w:b w:val="0"/>
           <w:sz w:val="24"/>
         </w:rPr>
-        <w:t>1. Revisão independente (red team) deste relatório e do código.</w:t>
+        <w:t>1. Reconciliar evento por evento os 2 votos após 19h e os 62 votos entre 17h e 18h.</w:t>
       </w:r>
     </w:p>
     <w:p>
@@ -3389,7 +4490,7 @@
           <w:b w:val="0"/>
           <w:sz w:val="24"/>
         </w:rPr>
-        <w:t>2. Explicar a diferença de 798 votos entre a soma dos BUs e os totais oficiais.</w:t>
+        <w:t>2. Extrair a série por minuto de habilitações e votos de toda a jornada e reextrair 2024 com o histograma.</w:t>
       </w:r>
     </w:p>
     <w:p>
@@ -3404,7 +4505,7 @@
           <w:b w:val="0"/>
           <w:sz w:val="24"/>
         </w:rPr>
-        <w:t>3. Enviar o pedido de acesso à informação sobre o horário de recebimento dos BUs e sobre as atas, para validar o relógio da urna por fonte externa.</w:t>
+        <w:t>3. Construir as referências da diretriz 01: levantar documentação de eleições anteriores à urna eletrônica (1990, 1992, 1994), registrando como não observados os parâmetros sem fonte; consolidar segundos turnos municipais (2000 a 2024) e estaduais.</w:t>
       </w:r>
     </w:p>
     <w:p>
@@ -3419,7 +4520,7 @@
           <w:b w:val="0"/>
           <w:sz w:val="24"/>
         </w:rPr>
-        <w:t>4. Conciliar BU por seção com cópias independentes (BU impresso ou QR Code coletado por fiscais).</w:t>
+        <w:t>4. Estimar o modelo de intensidade por minuto nas referências e aplicá-lo ao 2º turno de 2026, com poder estatístico e controles negativos.</w:t>
       </w:r>
     </w:p>
     <w:p>
@@ -3434,7 +4535,52 @@
           <w:b w:val="0"/>
           <w:sz w:val="24"/>
         </w:rPr>
-        <w:t>5. Execução nacional exploratória do Estudo 03 nas UFs com votação após 17h49.</w:t>
+        <w:t>5. Verificar nas atas a causa das 1.443 seções da população de auditoria.</w:t>
+      </w:r>
+    </w:p>
+    <w:p>
+      <w:pPr>
+        <w:spacing w:line="360" w:lineRule="auto" w:after="0"/>
+        <w:ind w:firstLine="709"/>
+        <w:jc w:val="both"/>
+      </w:pPr>
+      <w:r>
+        <w:rPr>
+          <w:rFonts w:ascii="Arial" w:hAnsi="Arial"/>
+          <w:b w:val="0"/>
+          <w:sz w:val="24"/>
+        </w:rPr>
+        <w:t>6. Enviar o pedido de acesso à informação sobre recepção dos BUs e atas.</w:t>
+      </w:r>
+    </w:p>
+    <w:p>
+      <w:pPr>
+        <w:spacing w:line="360" w:lineRule="auto" w:after="0"/>
+        <w:ind w:firstLine="709"/>
+        <w:jc w:val="both"/>
+      </w:pPr>
+      <w:r>
+        <w:rPr>
+          <w:rFonts w:ascii="Arial" w:hAnsi="Arial"/>
+          <w:b w:val="0"/>
+          <w:sz w:val="24"/>
+        </w:rPr>
+        <w:t>7. Inferência ecológica adequada da transferência de votos (Estudo 02).</w:t>
+      </w:r>
+    </w:p>
+    <w:p>
+      <w:pPr>
+        <w:spacing w:line="360" w:lineRule="auto" w:after="0"/>
+        <w:ind w:firstLine="709"/>
+        <w:jc w:val="both"/>
+      </w:pPr>
+      <w:r>
+        <w:rPr>
+          <w:rFonts w:ascii="Arial" w:hAnsi="Arial"/>
+          <w:b w:val="0"/>
+          <w:sz w:val="24"/>
+        </w:rPr>
+        <w:t>8. Revisão independente do código e do relatório.</w:t>
       </w:r>
     </w:p>
     <w:p>
@@ -3486,7 +4632,7 @@
           <w:b w:val="0"/>
           <w:sz w:val="24"/>
         </w:rPr>
-        <w:t>: mais de 34 mil votos foram registrados após as 17h no 2º turno. Brasília, DF: TSE, 2026a. Disponível em: https://www.tse.jus.br/comunicacao/noticias/2026/Outubro/eleicoes-2026-mais-de-34-mil-votos-foram-registrados-apos-as-17h-no-2o-turno. Acesso em: 29 out. 2026.</w:t>
+        <w:t>: mais de 34 mil votos foram registrados após as 17h no 2º turno. Brasília, DF: TSE, 2026a. Disponível em: https://www.tse.jus.br/comunicacao/noticias/2026/Outubro/eleicoes-2026-mais-de-34-mil-votos-foram-registrados-apos-as-17h-no-2o-turno. Acesso em: 30 out. 2026.</w:t>
       </w:r>
     </w:p>
     <w:p>
@@ -3517,7 +4663,7 @@
           <w:b w:val="0"/>
           <w:sz w:val="24"/>
         </w:rPr>
-        <w:t>: resultados 2026 e arquivos transmitidos para totalização. Brasília, DF: TSE, 2026b. Disponível em: https://dadosabertos.tse.jus.br. Acesso em: 29 out. 2026.</w:t>
+        <w:t>: resultados 2026, detalhamento por município e zona e arquivos transmitidos para totalização. Brasília, DF: TSE, 2026b. Disponível em: https://dadosabertos.tse.jus.br. Acesso em: 30 out. 2026.</w:t>
       </w:r>
     </w:p>
     <w:p>
@@ -3548,7 +4694,7 @@
           <w:b w:val="0"/>
           <w:sz w:val="24"/>
         </w:rPr>
-        <w:t>. Brasília, DF: TSE, 2026c. Disponível em: https://www.tse.jus.br/comunicacao/noticias/2026/Outubro/esclarecimento-sobre-prorrogacao-da-votacao. Acesso em: 29 out. 2026.</w:t>
+        <w:t>. Brasília, DF: TSE, 2026c. Disponível em: https://www.tse.jus.br/comunicacao/noticias/2026/Outubro/esclarecimento-sobre-prorrogacao-da-votacao. Acesso em: 30 out. 2026.</w:t>
       </w:r>
     </w:p>
     <w:p>
@@ -3579,7 +4725,7 @@
           <w:b w:val="0"/>
           <w:sz w:val="24"/>
         </w:rPr>
-        <w:t>. Brasília, DF: TSE, 2026d. Disponível em: https://www.tse.jus.br/legislacao/compilada/res/2026/resolucao-no-23-751-de-26-de-fevereiro-de-2026. Acesso em: 29 out. 2026.</w:t>
+        <w:t>. Brasília, DF: TSE, 2026d. Disponível em: https://www.tse.jus.br/legislacao/compilada/res/2026/resolucao-no-23-751-de-26-de-fevereiro-de-2026. Acesso em: 30 out. 2026.</w:t>
       </w:r>
     </w:p>
     <w:p>
@@ -3610,7 +4756,7 @@
           <w:b w:val="0"/>
           <w:sz w:val="24"/>
         </w:rPr>
-        <w:t>: resultados 2024 e arquivos transmitidos para totalização. Brasília, DF: TSE, 2024. Disponível em: https://dadosabertos.tse.jus.br/dataset/resultados-2024. Acesso em: 29 out. 2026.</w:t>
+        <w:t>: resultados 2024 e arquivos transmitidos para totalização. Brasília, DF: TSE, 2024. Disponível em: https://dadosabertos.tse.jus.br/dataset/resultados-2024. Acesso em: 30 out. 2026.</w:t>
       </w:r>
     </w:p>
     <w:sectPr>

</xml_diff>